<commit_message>
MAJ Final (enfin normalement)
</commit_message>
<xml_diff>
--- a/Epreuve - E6/Projet_NetCorp_BTS_Adrien_D/RealisationReseau/ANNEXE_VII_projet_adrien_d_reseau.docx
+++ b/Epreuve - E6/Projet_NetCorp_BTS_Adrien_D/RealisationReseau/ANNEXE_VII_projet_adrien_d_reseau.docx
@@ -5145,6 +5145,18 @@
             <w:proofErr w:type="spellEnd"/>
           </w:p>
           <w:p>
+            <w:pPr>
+              <w:pStyle w:val="ListParagraph"/>
+              <w:numPr>
+                <w:ilvl w:val="0"/>
+                <w:numId w:val="11"/>
+              </w:numPr>
+            </w:pPr>
+            <w:r>
+              <w:t>Borne Wi-Fi Aruba</w:t>
+            </w:r>
+          </w:p>
+          <w:p>
             <w:r>
               <w:t xml:space="preserve">      -     </w:t>
             </w:r>
@@ -5956,17 +5968,6 @@
           </w:p>
           <w:p>
             <w:pPr>
-              <w:snapToGrid w:val="0"/>
-              <w:jc w:val="both"/>
-              <w:rPr>
-                <w:rFonts w:ascii="Arial" w:hAnsi="Arial" w:cs="Arial"/>
-                <w:bCs/>
-                <w:sz w:val="20"/>
-              </w:rPr>
-            </w:pPr>
-          </w:p>
-          <w:p>
-            <w:pPr>
               <w:pStyle w:val="ListParagraph"/>
               <w:numPr>
                 <w:ilvl w:val="0"/>
@@ -6030,51 +6031,21 @@
               <w:rPr>
                 <w:lang w:val="en-US"/>
               </w:rPr>
-              <w:t xml:space="preserve"> </w:t>
-            </w:r>
+              <w:t xml:space="preserve"> 1To | RAM 25 Go | </w:t>
+            </w:r>
+            <w:proofErr w:type="gramStart"/>
             <w:r>
               <w:rPr>
                 <w:lang w:val="en-US"/>
               </w:rPr>
-              <w:t xml:space="preserve">1To </w:t>
-            </w:r>
+              <w:t>CPU :</w:t>
+            </w:r>
+            <w:proofErr w:type="gramEnd"/>
             <w:r>
               <w:rPr>
                 <w:lang w:val="en-US"/>
               </w:rPr>
-              <w:t xml:space="preserve">| </w:t>
-            </w:r>
-            <w:r>
-              <w:rPr>
-                <w:lang w:val="en-US"/>
-              </w:rPr>
-              <w:t>RAM</w:t>
-            </w:r>
-            <w:r>
-              <w:rPr>
-                <w:lang w:val="en-US"/>
-              </w:rPr>
-              <w:t xml:space="preserve"> 25 Go | </w:t>
-            </w:r>
-            <w:proofErr w:type="gramStart"/>
-            <w:r>
-              <w:rPr>
-                <w:lang w:val="en-US"/>
-              </w:rPr>
-              <w:t>CPU :</w:t>
-            </w:r>
-            <w:proofErr w:type="gramEnd"/>
-            <w:r>
-              <w:rPr>
-                <w:lang w:val="en-US"/>
-              </w:rPr>
-              <w:t xml:space="preserve"> Intel </w:t>
-            </w:r>
-            <w:r>
-              <w:rPr>
-                <w:lang w:val="en-US"/>
-              </w:rPr>
-              <w:t>i5</w:t>
+              <w:t xml:space="preserve"> Intel i5</w:t>
             </w:r>
           </w:p>
           <w:p>
@@ -6928,7 +6899,23 @@
                 <w:bCs/>
                 <w:sz w:val="20"/>
               </w:rPr>
-              <w:t xml:space="preserve"> avec 3 </w:t>
+              <w:t xml:space="preserve"> avec </w:t>
+            </w:r>
+            <w:r>
+              <w:rPr>
+                <w:rFonts w:ascii="Arial" w:hAnsi="Arial" w:cs="Arial"/>
+                <w:bCs/>
+                <w:sz w:val="20"/>
+              </w:rPr>
+              <w:t>4</w:t>
+            </w:r>
+            <w:r>
+              <w:rPr>
+                <w:rFonts w:ascii="Arial" w:hAnsi="Arial" w:cs="Arial"/>
+                <w:bCs/>
+                <w:sz w:val="20"/>
+              </w:rPr>
+              <w:t xml:space="preserve"> </w:t>
             </w:r>
             <w:proofErr w:type="spellStart"/>
             <w:r>
@@ -7570,8 +7557,9 @@
                 <w:sz w:val="20"/>
                 <w:lang w:val="es-ES"/>
               </w:rPr>
-              <w:t xml:space="preserve"> à DEBIAN-GLPI</w:t>
-            </w:r>
+              <w:t xml:space="preserve"> à DEBIAN-</w:t>
+            </w:r>
+            <w:proofErr w:type="gramStart"/>
             <w:r>
               <w:rPr>
                 <w:rFonts w:ascii="Arial" w:hAnsi="Arial" w:cs="Arial"/>
@@ -7579,9 +7567,8 @@
                 <w:sz w:val="20"/>
                 <w:lang w:val="es-ES"/>
               </w:rPr>
-              <w:t xml:space="preserve">, Debian </w:t>
-            </w:r>
-            <w:proofErr w:type="gramStart"/>
+              <w:t>GLPI</w:t>
+            </w:r>
             <w:r>
               <w:rPr>
                 <w:rFonts w:ascii="Arial" w:hAnsi="Arial" w:cs="Arial"/>
@@ -7589,7 +7576,7 @@
                 <w:sz w:val="20"/>
                 <w:lang w:val="es-ES"/>
               </w:rPr>
-              <w:t>13</w:t>
+              <w:t xml:space="preserve"> </w:t>
             </w:r>
             <w:r>
               <w:rPr>
@@ -7598,7 +7585,7 @@
                 <w:sz w:val="20"/>
                 <w:lang w:val="es-ES"/>
               </w:rPr>
-              <w:t xml:space="preserve"> :</w:t>
+              <w:t>:</w:t>
             </w:r>
             <w:proofErr w:type="gramEnd"/>
             <w:r>
@@ -7781,7 +7768,6 @@
               <w:rPr>
                 <w:rFonts w:ascii="Arial" w:hAnsi="Arial" w:cs="Arial"/>
                 <w:bCs/>
-                <w:sz w:val="20"/>
                 <w:u w:val="single"/>
               </w:rPr>
             </w:pPr>
@@ -7789,7 +7775,6 @@
               <w:rPr>
                 <w:rFonts w:ascii="Arial" w:hAnsi="Arial" w:cs="Arial"/>
                 <w:bCs/>
-                <w:sz w:val="20"/>
                 <w:u w:val="single"/>
               </w:rPr>
               <w:t xml:space="preserve">Accès à la documentation du projet </w:t>
@@ -7798,7 +7783,6 @@
               <w:rPr>
                 <w:rFonts w:ascii="Arial" w:hAnsi="Arial" w:cs="Arial"/>
                 <w:bCs/>
-                <w:sz w:val="20"/>
               </w:rPr>
               <w:t>: </w:t>
             </w:r>
@@ -7821,38 +7805,46 @@
               <w:jc w:val="both"/>
               <w:rPr>
                 <w:rFonts w:ascii="Arial" w:hAnsi="Arial" w:cs="Arial"/>
-                <w:b/>
-                <w:sz w:val="20"/>
-              </w:rPr>
-            </w:pPr>
-            <w:r>
-              <w:rPr>
-                <w:rFonts w:ascii="Arial" w:hAnsi="Arial" w:cs="Arial"/>
-                <w:b/>
-                <w:sz w:val="20"/>
-              </w:rPr>
-              <w:t>Livrable Projet</w:t>
-            </w:r>
-            <w:r>
-              <w:rPr>
-                <w:rFonts w:ascii="Arial" w:hAnsi="Arial" w:cs="Arial"/>
-                <w:b/>
-                <w:sz w:val="20"/>
-              </w:rPr>
-              <w:t> </w:t>
-            </w:r>
-            <w:r>
-              <w:rPr>
-                <w:rFonts w:ascii="Arial" w:hAnsi="Arial" w:cs="Arial"/>
-                <w:b/>
-                <w:sz w:val="20"/>
-              </w:rPr>
-              <w:t xml:space="preserve">Réalisation 1 Réseau </w:t>
-            </w:r>
-            <w:r>
-              <w:rPr>
-                <w:rFonts w:ascii="Arial" w:hAnsi="Arial" w:cs="Arial"/>
-                <w:b/>
+                <w:bCs/>
+                <w:sz w:val="20"/>
+              </w:rPr>
+            </w:pPr>
+            <w:r>
+              <w:rPr>
+                <w:rFonts w:ascii="Arial" w:hAnsi="Arial" w:cs="Arial"/>
+                <w:bCs/>
+                <w:sz w:val="20"/>
+              </w:rPr>
+              <w:t xml:space="preserve">Documentation </w:t>
+            </w:r>
+            <w:r>
+              <w:rPr>
+                <w:rFonts w:ascii="Arial" w:hAnsi="Arial" w:cs="Arial"/>
+                <w:bCs/>
+                <w:sz w:val="20"/>
+              </w:rPr>
+              <w:t>c</w:t>
+            </w:r>
+            <w:r>
+              <w:rPr>
+                <w:rFonts w:ascii="Arial" w:hAnsi="Arial" w:cs="Arial"/>
+                <w:bCs/>
+                <w:sz w:val="20"/>
+              </w:rPr>
+              <w:t>omplète de la réalisation</w:t>
+            </w:r>
+            <w:r>
+              <w:rPr>
+                <w:rFonts w:ascii="Arial" w:hAnsi="Arial" w:cs="Arial"/>
+                <w:bCs/>
+                <w:sz w:val="20"/>
+              </w:rPr>
+              <w:t xml:space="preserve"> </w:t>
+            </w:r>
+            <w:r>
+              <w:rPr>
+                <w:rFonts w:ascii="Arial" w:hAnsi="Arial" w:cs="Arial"/>
+                <w:bCs/>
                 <w:sz w:val="20"/>
               </w:rPr>
               <w:t>:</w:t>
@@ -7864,27 +7856,100 @@
               <w:jc w:val="both"/>
               <w:rPr>
                 <w:rFonts w:ascii="Arial" w:hAnsi="Arial" w:cs="Arial"/>
-                <w:bCs/>
-                <w:sz w:val="20"/>
-              </w:rPr>
-            </w:pPr>
-            <w:r>
-              <w:rPr>
-                <w:rFonts w:ascii="Arial" w:hAnsi="Arial" w:cs="Arial"/>
-                <w:b/>
-                <w:sz w:val="20"/>
-              </w:rPr>
-              <w:t xml:space="preserve"> </w:t>
-            </w:r>
+                <w:b/>
+                <w:sz w:val="20"/>
+              </w:rPr>
+            </w:pPr>
+          </w:p>
+          <w:p>
+            <w:pPr>
+              <w:snapToGrid w:val="0"/>
+              <w:jc w:val="both"/>
+              <w:rPr>
+                <w:rFonts w:ascii="Arial" w:hAnsi="Arial" w:cs="Arial"/>
+                <w:bCs/>
+                <w:sz w:val="20"/>
+              </w:rPr>
+            </w:pPr>
+            <w:r>
+              <w:rPr>
+                <w:rFonts w:ascii="Arial" w:hAnsi="Arial" w:cs="Arial"/>
+                <w:b/>
+                <w:sz w:val="20"/>
+              </w:rPr>
+              <w:t>https://github.com/adriendemange/DEMANGE/blob/main/Epreuve%20-%20E6/Projet_NetCorp_BTS_Adrien_D/RealisationReseau/netcorp_reseau_rendu.docx</w:t>
+            </w:r>
+          </w:p>
+          <w:p>
+            <w:pPr>
+              <w:snapToGrid w:val="0"/>
+              <w:jc w:val="both"/>
+              <w:rPr>
+                <w:rFonts w:ascii="Arial" w:hAnsi="Arial" w:cs="Arial"/>
+                <w:b/>
+                <w:sz w:val="20"/>
+              </w:rPr>
+            </w:pPr>
+          </w:p>
+          <w:p>
+            <w:pPr>
+              <w:snapToGrid w:val="0"/>
+              <w:jc w:val="both"/>
+              <w:rPr>
+                <w:rFonts w:ascii="Arial" w:hAnsi="Arial" w:cs="Arial"/>
+                <w:bCs/>
+                <w:sz w:val="20"/>
+              </w:rPr>
+            </w:pPr>
+            <w:r>
+              <w:rPr>
+                <w:rFonts w:ascii="Arial" w:hAnsi="Arial" w:cs="Arial"/>
+                <w:bCs/>
+                <w:sz w:val="20"/>
+              </w:rPr>
+              <w:t xml:space="preserve">Maquette Réseau Cisco </w:t>
+            </w:r>
+            <w:proofErr w:type="spellStart"/>
+            <w:r>
+              <w:rPr>
+                <w:rFonts w:ascii="Arial" w:hAnsi="Arial" w:cs="Arial"/>
+                <w:bCs/>
+                <w:sz w:val="20"/>
+              </w:rPr>
+              <w:t>Packet</w:t>
+            </w:r>
+            <w:proofErr w:type="spellEnd"/>
+            <w:r>
+              <w:rPr>
+                <w:rFonts w:ascii="Arial" w:hAnsi="Arial" w:cs="Arial"/>
+                <w:bCs/>
+                <w:sz w:val="20"/>
+              </w:rPr>
+              <w:t xml:space="preserve"> Tracer : </w:t>
+            </w:r>
+          </w:p>
+          <w:p>
+            <w:pPr>
+              <w:snapToGrid w:val="0"/>
+              <w:jc w:val="both"/>
+              <w:rPr>
+                <w:rFonts w:ascii="Arial" w:hAnsi="Arial" w:cs="Arial"/>
+                <w:bCs/>
+                <w:sz w:val="20"/>
+              </w:rPr>
+            </w:pPr>
+          </w:p>
+          <w:p>
+            <w:pPr>
+              <w:snapToGrid w:val="0"/>
+              <w:jc w:val="both"/>
+            </w:pPr>
             <w:hyperlink r:id="rId9" w:history="1">
               <w:r>
                 <w:rPr>
                   <w:rStyle w:val="Hyperlink"/>
-                  <w:rFonts w:ascii="Arial" w:hAnsi="Arial" w:cs="Arial"/>
-                  <w:bCs/>
-                  <w:sz w:val="20"/>
                 </w:rPr>
-                <w:t>https://github.com/adriendemange/DEMANGE/blob/main/Projet_NetCorp_BTS_Adrien_D/RealisationReseau/netcorp_reseau_documentation.docx</w:t>
+                <w:t>https://github.com/adriendemange/DEMANGE/blob/main/Epreuve%20-%20E6/Projet_NetCorp_BTS_Adrien_D/RealisationReseau/netcorp_reseau_maquette.pkt</w:t>
               </w:r>
             </w:hyperlink>
           </w:p>
@@ -7905,35 +7970,33 @@
               <w:jc w:val="both"/>
               <w:rPr>
                 <w:rFonts w:ascii="Arial" w:hAnsi="Arial" w:cs="Arial"/>
-                <w:b/>
-                <w:sz w:val="20"/>
-              </w:rPr>
-            </w:pPr>
-            <w:r>
-              <w:rPr>
-                <w:rFonts w:ascii="Arial" w:hAnsi="Arial" w:cs="Arial"/>
-                <w:b/>
-                <w:sz w:val="20"/>
-              </w:rPr>
-              <w:t xml:space="preserve">Maquette Réseau Cisco </w:t>
-            </w:r>
-            <w:proofErr w:type="spellStart"/>
-            <w:r>
-              <w:rPr>
-                <w:rFonts w:ascii="Arial" w:hAnsi="Arial" w:cs="Arial"/>
-                <w:b/>
-                <w:sz w:val="20"/>
-              </w:rPr>
-              <w:t>Packet</w:t>
-            </w:r>
-            <w:proofErr w:type="spellEnd"/>
-            <w:r>
-              <w:rPr>
-                <w:rFonts w:ascii="Arial" w:hAnsi="Arial" w:cs="Arial"/>
-                <w:b/>
-                <w:sz w:val="20"/>
-              </w:rPr>
-              <w:t xml:space="preserve"> Tracer : </w:t>
+                <w:bCs/>
+                <w:sz w:val="20"/>
+              </w:rPr>
+            </w:pPr>
+            <w:r>
+              <w:rPr>
+                <w:rFonts w:ascii="Arial" w:hAnsi="Arial" w:cs="Arial"/>
+                <w:bCs/>
+                <w:sz w:val="20"/>
+              </w:rPr>
+              <w:t>Schéma</w:t>
+            </w:r>
+            <w:r>
+              <w:rPr>
+                <w:rFonts w:ascii="Arial" w:hAnsi="Arial" w:cs="Arial"/>
+                <w:bCs/>
+                <w:sz w:val="20"/>
+              </w:rPr>
+              <w:t xml:space="preserve"> </w:t>
+            </w:r>
+            <w:r>
+              <w:rPr>
+                <w:rFonts w:ascii="Arial" w:hAnsi="Arial" w:cs="Arial"/>
+                <w:bCs/>
+                <w:sz w:val="20"/>
+              </w:rPr>
+              <w:t xml:space="preserve">Réseau : </w:t>
             </w:r>
           </w:p>
           <w:p>
@@ -7951,100 +8014,13 @@
             <w:pPr>
               <w:snapToGrid w:val="0"/>
               <w:jc w:val="both"/>
-              <w:rPr>
-                <w:rFonts w:ascii="Arial" w:hAnsi="Arial" w:cs="Arial"/>
-                <w:bCs/>
-                <w:sz w:val="20"/>
-              </w:rPr>
             </w:pPr>
             <w:hyperlink r:id="rId10" w:history="1">
               <w:r>
                 <w:rPr>
                   <w:rStyle w:val="Hyperlink"/>
-                  <w:rFonts w:ascii="Arial" w:hAnsi="Arial" w:cs="Arial"/>
-                  <w:bCs/>
-                  <w:sz w:val="20"/>
                 </w:rPr>
-                <w:t>https://github.com/adriendemange/DEMANGE/blob/main/Projet_NetCorp_BTS_Adrien_D/RealisationReseau/netcorp_reseau_maquette.pkt</w:t>
-              </w:r>
-            </w:hyperlink>
-          </w:p>
-          <w:p>
-            <w:pPr>
-              <w:snapToGrid w:val="0"/>
-              <w:jc w:val="both"/>
-              <w:rPr>
-                <w:rFonts w:ascii="Arial" w:hAnsi="Arial" w:cs="Arial"/>
-                <w:b/>
-                <w:sz w:val="20"/>
-              </w:rPr>
-            </w:pPr>
-          </w:p>
-          <w:p>
-            <w:pPr>
-              <w:snapToGrid w:val="0"/>
-              <w:jc w:val="both"/>
-              <w:rPr>
-                <w:rFonts w:ascii="Arial" w:hAnsi="Arial" w:cs="Arial"/>
-                <w:b/>
-                <w:sz w:val="20"/>
-              </w:rPr>
-            </w:pPr>
-            <w:r>
-              <w:rPr>
-                <w:rFonts w:ascii="Arial" w:hAnsi="Arial" w:cs="Arial"/>
-                <w:b/>
-                <w:sz w:val="20"/>
-              </w:rPr>
-              <w:t>Schéma</w:t>
-            </w:r>
-            <w:r>
-              <w:rPr>
-                <w:rFonts w:ascii="Arial" w:hAnsi="Arial" w:cs="Arial"/>
-                <w:b/>
-                <w:sz w:val="20"/>
-              </w:rPr>
-              <w:t xml:space="preserve"> </w:t>
-            </w:r>
-            <w:r>
-              <w:rPr>
-                <w:rFonts w:ascii="Arial" w:hAnsi="Arial" w:cs="Arial"/>
-                <w:b/>
-                <w:sz w:val="20"/>
-              </w:rPr>
-              <w:t xml:space="preserve">Réseau : </w:t>
-            </w:r>
-          </w:p>
-          <w:p>
-            <w:pPr>
-              <w:snapToGrid w:val="0"/>
-              <w:jc w:val="both"/>
-              <w:rPr>
-                <w:rFonts w:ascii="Arial" w:hAnsi="Arial" w:cs="Arial"/>
-                <w:bCs/>
-                <w:sz w:val="20"/>
-              </w:rPr>
-            </w:pPr>
-          </w:p>
-          <w:p>
-            <w:pPr>
-              <w:snapToGrid w:val="0"/>
-              <w:jc w:val="both"/>
-              <w:rPr>
-                <w:rFonts w:ascii="Arial" w:hAnsi="Arial" w:cs="Arial"/>
-                <w:bCs/>
-                <w:sz w:val="20"/>
-              </w:rPr>
-            </w:pPr>
-            <w:hyperlink r:id="rId11" w:history="1">
-              <w:r>
-                <w:rPr>
-                  <w:rStyle w:val="Hyperlink"/>
-                  <w:rFonts w:ascii="Arial" w:hAnsi="Arial" w:cs="Arial"/>
-                  <w:bCs/>
-                  <w:sz w:val="20"/>
-                </w:rPr>
-                <w:t>https://github.com/adriendemange/DEMANGE/blob/main/Projet_NetCorp_BTS_Adrien_D/RealisationReseau/netcorp_reseau_schema.pdf</w:t>
+                <w:t>https://github.com/adriendemange/DEMANGE/blob/main/Epreuve%20-%20E6/Projet_NetCorp_BTS_Adrien_D/RealisationReseau/netcorp_reseau_schema.pdf</w:t>
               </w:r>
             </w:hyperlink>
           </w:p>
@@ -8510,6 +8486,68 @@
                 <w:sz w:val="20"/>
                 <w:szCs w:val="20"/>
               </w:rPr>
+              <w:t xml:space="preserve">Le réseau de </w:t>
+            </w:r>
+            <w:proofErr w:type="spellStart"/>
+            <w:r>
+              <w:rPr>
+                <w:rFonts w:ascii="Arial" w:hAnsi="Arial"/>
+                <w:bCs/>
+                <w:sz w:val="20"/>
+                <w:szCs w:val="20"/>
+              </w:rPr>
+              <w:t>NetCorp</w:t>
+            </w:r>
+            <w:proofErr w:type="spellEnd"/>
+            <w:r>
+              <w:rPr>
+                <w:rFonts w:ascii="Arial" w:hAnsi="Arial"/>
+                <w:bCs/>
+                <w:sz w:val="20"/>
+                <w:szCs w:val="20"/>
+              </w:rPr>
+              <w:t xml:space="preserve"> est segmenté en 3 VLANs distincts, chacun correspondant à un service de l'entreprise. Le routage inter-VLAN est assuré par le routeur Cisco C8200L via des sous-interfaces (router-on-a-stick)</w:t>
+            </w:r>
+            <w:r>
+              <w:rPr>
+                <w:rFonts w:ascii="Arial" w:hAnsi="Arial"/>
+                <w:bCs/>
+                <w:sz w:val="20"/>
+                <w:szCs w:val="20"/>
+              </w:rPr>
+              <w:t> :</w:t>
+            </w:r>
+          </w:p>
+          <w:p>
+            <w:pPr>
+              <w:snapToGrid w:val="0"/>
+              <w:spacing w:line="276" w:lineRule="auto"/>
+              <w:rPr>
+                <w:rFonts w:ascii="Arial" w:hAnsi="Arial"/>
+                <w:bCs/>
+                <w:sz w:val="20"/>
+                <w:szCs w:val="20"/>
+              </w:rPr>
+            </w:pPr>
+          </w:p>
+          <w:p>
+            <w:pPr>
+              <w:snapToGrid w:val="0"/>
+              <w:spacing w:line="276" w:lineRule="auto"/>
+              <w:rPr>
+                <w:rFonts w:ascii="Arial" w:hAnsi="Arial"/>
+                <w:bCs/>
+                <w:sz w:val="20"/>
+                <w:szCs w:val="20"/>
+              </w:rPr>
+            </w:pPr>
+            <w:r>
+              <w:rPr>
+                <w:rFonts w:ascii="Arial" w:hAnsi="Arial"/>
+                <w:bCs/>
+                <w:sz w:val="20"/>
+                <w:szCs w:val="20"/>
+              </w:rPr>
               <w:t xml:space="preserve">Voici le plan d’adressage </w:t>
             </w:r>
             <w:r>
@@ -8578,7 +8616,7 @@
                           <pic:cNvPicPr/>
                         </pic:nvPicPr>
                         <pic:blipFill>
-                          <a:blip r:embed="rId12"/>
+                          <a:blip r:embed="rId11"/>
                           <a:stretch>
                             <a:fillRect/>
                           </a:stretch>
@@ -8677,7 +8715,36 @@
                 <w:sz w:val="20"/>
                 <w:szCs w:val="20"/>
               </w:rPr>
-              <w:t xml:space="preserve"> utilisés sur le projet : </w:t>
+              <w:t xml:space="preserve"> </w:t>
+            </w:r>
+            <w:r>
+              <w:rPr>
+                <w:rFonts w:ascii="Arial" w:hAnsi="Arial"/>
+                <w:bCs/>
+                <w:sz w:val="20"/>
+                <w:szCs w:val="20"/>
+              </w:rPr>
+              <w:t xml:space="preserve">du réseau de </w:t>
+            </w:r>
+            <w:proofErr w:type="spellStart"/>
+            <w:r>
+              <w:rPr>
+                <w:rFonts w:ascii="Arial" w:hAnsi="Arial"/>
+                <w:bCs/>
+                <w:sz w:val="20"/>
+                <w:szCs w:val="20"/>
+              </w:rPr>
+              <w:t>NetCorp</w:t>
+            </w:r>
+            <w:proofErr w:type="spellEnd"/>
+            <w:r>
+              <w:rPr>
+                <w:rFonts w:ascii="Arial" w:hAnsi="Arial"/>
+                <w:bCs/>
+                <w:sz w:val="20"/>
+                <w:szCs w:val="20"/>
+              </w:rPr>
+              <w:t xml:space="preserve"> : </w:t>
             </w:r>
           </w:p>
           <w:p>
@@ -8727,7 +8794,7 @@
                           <pic:cNvPicPr/>
                         </pic:nvPicPr>
                         <pic:blipFill>
-                          <a:blip r:embed="rId13"/>
+                          <a:blip r:embed="rId12"/>
                           <a:stretch>
                             <a:fillRect/>
                           </a:stretch>
@@ -8778,7 +8845,45 @@
                 <w:sz w:val="20"/>
                 <w:szCs w:val="20"/>
               </w:rPr>
-              <w:t xml:space="preserve">Voici le schéma réseau du projet mis en place : </w:t>
+              <w:t xml:space="preserve">Voici le schéma réseau </w:t>
+            </w:r>
+            <w:r>
+              <w:rPr>
+                <w:rFonts w:ascii="Arial" w:hAnsi="Arial"/>
+                <w:bCs/>
+                <w:sz w:val="20"/>
+                <w:szCs w:val="20"/>
+              </w:rPr>
+              <w:t xml:space="preserve">de </w:t>
+            </w:r>
+            <w:proofErr w:type="spellStart"/>
+            <w:r>
+              <w:rPr>
+                <w:rFonts w:ascii="Arial" w:hAnsi="Arial"/>
+                <w:bCs/>
+                <w:sz w:val="20"/>
+                <w:szCs w:val="20"/>
+              </w:rPr>
+              <w:t>NetCorp</w:t>
+            </w:r>
+            <w:proofErr w:type="spellEnd"/>
+            <w:r>
+              <w:rPr>
+                <w:rFonts w:ascii="Arial" w:hAnsi="Arial"/>
+                <w:bCs/>
+                <w:sz w:val="20"/>
+                <w:szCs w:val="20"/>
+              </w:rPr>
+              <w:t xml:space="preserve"> </w:t>
+            </w:r>
+            <w:r>
+              <w:rPr>
+                <w:rFonts w:ascii="Arial" w:hAnsi="Arial"/>
+                <w:bCs/>
+                <w:sz w:val="20"/>
+                <w:szCs w:val="20"/>
+              </w:rPr>
+              <w:t xml:space="preserve">: </w:t>
             </w:r>
           </w:p>
           <w:p>
@@ -8828,7 +8933,7 @@
                           <pic:cNvPicPr/>
                         </pic:nvPicPr>
                         <pic:blipFill>
-                          <a:blip r:embed="rId14"/>
+                          <a:blip r:embed="rId13"/>
                           <a:stretch>
                             <a:fillRect/>
                           </a:stretch>
@@ -8935,6 +9040,7 @@
                 <w:sz w:val="20"/>
                 <w:szCs w:val="20"/>
               </w:rPr>
+              <w:lastRenderedPageBreak/>
               <w:t>ainsi</w:t>
             </w:r>
             <w:proofErr w:type="gramEnd"/>
@@ -9071,6 +9177,45 @@
           </w:p>
           <w:p>
             <w:pPr>
+              <w:snapToGrid w:val="0"/>
+              <w:spacing w:line="276" w:lineRule="auto"/>
+              <w:ind w:left="360"/>
+            </w:pPr>
+          </w:p>
+          <w:p>
+            <w:pPr>
+              <w:snapToGrid w:val="0"/>
+              <w:spacing w:line="276" w:lineRule="auto"/>
+            </w:pPr>
+            <w:r>
+              <w:t xml:space="preserve">Des </w:t>
+            </w:r>
+            <w:r>
+              <w:t>listes de contrôle d’accès (</w:t>
+            </w:r>
+            <w:proofErr w:type="spellStart"/>
+            <w:r>
+              <w:t>ACLs</w:t>
+            </w:r>
+            <w:proofErr w:type="spellEnd"/>
+            <w:r>
+              <w:t>)</w:t>
+            </w:r>
+            <w:r>
+              <w:t xml:space="preserve"> ont été mises en place afin de limiter chaque réseau et sécuriser l’infrastructure</w:t>
+            </w:r>
+            <w:r>
+              <w:t> :</w:t>
+            </w:r>
+          </w:p>
+          <w:p>
+            <w:pPr>
+              <w:snapToGrid w:val="0"/>
+              <w:spacing w:line="276" w:lineRule="auto"/>
+            </w:pPr>
+          </w:p>
+          <w:p>
+            <w:pPr>
               <w:pStyle w:val="ListParagraph"/>
               <w:numPr>
                 <w:ilvl w:val="0"/>
@@ -9079,39 +9224,11 @@
               <w:snapToGrid w:val="0"/>
               <w:spacing w:line="276" w:lineRule="auto"/>
             </w:pPr>
-          </w:p>
-          <w:p>
-            <w:pPr>
-              <w:snapToGrid w:val="0"/>
-              <w:spacing w:line="276" w:lineRule="auto"/>
-            </w:pPr>
-            <w:r>
-              <w:t xml:space="preserve">Des Access Control </w:t>
-            </w:r>
-            <w:proofErr w:type="spellStart"/>
-            <w:r>
-              <w:t>Lists</w:t>
-            </w:r>
-            <w:proofErr w:type="spellEnd"/>
-            <w:r>
-              <w:t xml:space="preserve"> ont été mises en place afin de limiter chaque réseau et sécuriser l’infrastructure.</w:t>
-            </w:r>
-          </w:p>
-          <w:p>
-            <w:pPr>
-              <w:snapToGrid w:val="0"/>
-              <w:spacing w:line="276" w:lineRule="auto"/>
-            </w:pPr>
-            <w:r>
-              <w:t xml:space="preserve">Création de 3 </w:t>
-            </w:r>
-            <w:proofErr w:type="spellStart"/>
-            <w:r>
-              <w:t>ACLs</w:t>
-            </w:r>
-            <w:proofErr w:type="spellEnd"/>
-            <w:r>
-              <w:t xml:space="preserve"> : </w:t>
+            <w:r>
+              <w:t>ACL_IT_ADRIEN</w:t>
+            </w:r>
+            <w:r>
+              <w:t> : Accès complet – Administration de tous les VLANs</w:t>
             </w:r>
           </w:p>
           <w:p>
@@ -9131,10 +9248,29 @@
               <w:spacing w:line="276" w:lineRule="auto"/>
             </w:pPr>
             <w:r>
-              <w:t>ACL_IT_ADRIEN</w:t>
-            </w:r>
-            <w:r>
-              <w:t> : Accès complet – Administration de tous les VLANs</w:t>
+              <w:t>ACL_DIRECTION_ADRIEN</w:t>
+            </w:r>
+            <w:r>
+              <w:t xml:space="preserve"> : Accès à Internet, aux services </w:t>
+            </w:r>
+            <w:proofErr w:type="gramStart"/>
+            <w:r>
+              <w:t>DNS,DHCP</w:t>
+            </w:r>
+            <w:proofErr w:type="gramEnd"/>
+            <w:r>
+              <w:t>,</w:t>
+            </w:r>
+            <w:proofErr w:type="gramStart"/>
+            <w:r>
+              <w:t>SMB,LDAP</w:t>
+            </w:r>
+            <w:proofErr w:type="gramEnd"/>
+            <w:r>
+              <w:t xml:space="preserve"> | Pas d’accès au VLAN IT et VLAN RH</w:t>
+            </w:r>
+            <w:r>
+              <w:t>.</w:t>
             </w:r>
           </w:p>
           <w:p>
@@ -9154,10 +9290,13 @@
               <w:spacing w:line="276" w:lineRule="auto"/>
             </w:pPr>
             <w:r>
-              <w:t>ACL_DIRECTION_ADRIEN</w:t>
-            </w:r>
-            <w:r>
-              <w:t xml:space="preserve"> : Accès à Internet, aux services </w:t>
+              <w:t>ACL_RH_ADRIEN</w:t>
+            </w:r>
+            <w:r>
+              <w:t xml:space="preserve"> : </w:t>
+            </w:r>
+            <w:r>
+              <w:t xml:space="preserve">Accès à Internet, aux services </w:t>
             </w:r>
             <w:proofErr w:type="gramStart"/>
             <w:r>
@@ -9173,16 +9312,69 @@
             </w:r>
             <w:proofErr w:type="gramEnd"/>
             <w:r>
-              <w:t xml:space="preserve"> | Pas d’accès au VLAN IT et VLAN RH</w:t>
-            </w:r>
-            <w:r>
-              <w:t>.</w:t>
+              <w:t xml:space="preserve"> | Pas d’accès au VLAN IT et VLAN</w:t>
+            </w:r>
+            <w:r>
+              <w:t xml:space="preserve"> Direction.</w:t>
             </w:r>
           </w:p>
           <w:p>
             <w:pPr>
               <w:snapToGrid w:val="0"/>
               <w:spacing w:line="276" w:lineRule="auto"/>
+            </w:pPr>
+          </w:p>
+          <w:p>
+            <w:pPr>
+              <w:snapToGrid w:val="0"/>
+              <w:spacing w:line="276" w:lineRule="auto"/>
+            </w:pPr>
+            <w:r>
+              <w:t xml:space="preserve">Les services DNS et DHCP sont hébergés sur le serveur SRV-AD (Windows Server 2025) joint au domaine </w:t>
+            </w:r>
+            <w:proofErr w:type="spellStart"/>
+            <w:r>
+              <w:t>LAB.local</w:t>
+            </w:r>
+            <w:proofErr w:type="spellEnd"/>
+            <w:r>
+              <w:t>. Le relais DHCP</w:t>
+            </w:r>
+            <w:r>
+              <w:t xml:space="preserve"> </w:t>
+            </w:r>
+            <w:r>
+              <w:t>est configuré sur le routeur pour chaque sous-interface VLAN.</w:t>
+            </w:r>
+          </w:p>
+          <w:p>
+            <w:pPr>
+              <w:snapToGrid w:val="0"/>
+              <w:spacing w:line="276" w:lineRule="auto"/>
+            </w:pPr>
+          </w:p>
+          <w:p>
+            <w:pPr>
+              <w:snapToGrid w:val="0"/>
+              <w:spacing w:line="276" w:lineRule="auto"/>
+              <w:rPr>
+                <w:u w:val="single"/>
+              </w:rPr>
+            </w:pPr>
+            <w:r>
+              <w:rPr>
+                <w:u w:val="single"/>
+              </w:rPr>
+              <w:t xml:space="preserve">Zones DNS : </w:t>
+            </w:r>
+          </w:p>
+          <w:p>
+            <w:pPr>
+              <w:snapToGrid w:val="0"/>
+              <w:spacing w:line="276" w:lineRule="auto"/>
+              <w:rPr>
+                <w:u w:val="single"/>
+              </w:rPr>
             </w:pPr>
           </w:p>
           <w:p>
@@ -9195,91 +9387,20 @@
               <w:snapToGrid w:val="0"/>
               <w:spacing w:line="276" w:lineRule="auto"/>
             </w:pPr>
-            <w:r>
-              <w:t>ACL_RH_ADRIEN</w:t>
-            </w:r>
-            <w:r>
-              <w:t xml:space="preserve"> : </w:t>
-            </w:r>
-            <w:r>
-              <w:t xml:space="preserve">Accès à Internet, aux services </w:t>
-            </w:r>
-            <w:proofErr w:type="gramStart"/>
-            <w:r>
-              <w:t>DNS,DHCP</w:t>
-            </w:r>
-            <w:proofErr w:type="gramEnd"/>
-            <w:r>
-              <w:t>,</w:t>
-            </w:r>
-            <w:proofErr w:type="gramStart"/>
-            <w:r>
-              <w:t>SMB,LDAP</w:t>
-            </w:r>
-            <w:proofErr w:type="gramEnd"/>
-            <w:r>
-              <w:t xml:space="preserve"> | Pas d’accès au VLAN IT et VLAN</w:t>
-            </w:r>
-            <w:r>
-              <w:t xml:space="preserve"> Direction.</w:t>
-            </w:r>
-          </w:p>
-          <w:p>
-            <w:pPr>
-              <w:snapToGrid w:val="0"/>
-              <w:spacing w:line="276" w:lineRule="auto"/>
-            </w:pPr>
-          </w:p>
-          <w:p>
-            <w:pPr>
-              <w:snapToGrid w:val="0"/>
-              <w:spacing w:line="276" w:lineRule="auto"/>
-            </w:pPr>
-            <w:r>
-              <w:t>Concernant le</w:t>
-            </w:r>
-            <w:r>
-              <w:t>s</w:t>
-            </w:r>
-            <w:r>
-              <w:t xml:space="preserve"> service</w:t>
-            </w:r>
-            <w:r>
-              <w:t>s</w:t>
-            </w:r>
-            <w:r>
-              <w:t xml:space="preserve"> DNS &amp; DHCP, ils ont été mis en place sur le serveur Windows 2025 principal gérant l’Active Directory. </w:t>
-            </w:r>
-          </w:p>
-          <w:p>
-            <w:pPr>
-              <w:snapToGrid w:val="0"/>
-              <w:spacing w:line="276" w:lineRule="auto"/>
-            </w:pPr>
-          </w:p>
-          <w:p>
-            <w:pPr>
-              <w:snapToGrid w:val="0"/>
-              <w:spacing w:line="276" w:lineRule="auto"/>
-              <w:rPr>
-                <w:u w:val="single"/>
-              </w:rPr>
-            </w:pPr>
-            <w:r>
-              <w:rPr>
-                <w:u w:val="single"/>
-              </w:rPr>
-              <w:t xml:space="preserve">Zones DNS : </w:t>
-            </w:r>
-          </w:p>
-          <w:p>
-            <w:pPr>
-              <w:snapToGrid w:val="0"/>
-              <w:spacing w:line="276" w:lineRule="auto"/>
-              <w:rPr>
-                <w:u w:val="single"/>
-              </w:rPr>
-            </w:pPr>
+            <w:proofErr w:type="spellStart"/>
+            <w:r>
+              <w:t>LAB.local</w:t>
+            </w:r>
+            <w:proofErr w:type="spellEnd"/>
+            <w:r>
+              <w:t xml:space="preserve"> -&gt; 192.168.</w:t>
+            </w:r>
+            <w:r>
+              <w:t>223</w:t>
+            </w:r>
+            <w:r>
+              <w:t>.10</w:t>
+            </w:r>
           </w:p>
           <w:p>
             <w:pPr>
@@ -9292,18 +9413,123 @@
               <w:spacing w:line="276" w:lineRule="auto"/>
             </w:pPr>
             <w:proofErr w:type="spellStart"/>
+            <w:proofErr w:type="gramStart"/>
+            <w:r>
+              <w:t>glpi.lab.local</w:t>
+            </w:r>
+            <w:proofErr w:type="spellEnd"/>
+            <w:proofErr w:type="gramEnd"/>
+            <w:r>
+              <w:t xml:space="preserve"> -&gt; 192.168.</w:t>
+            </w:r>
+            <w:r>
+              <w:t>223</w:t>
+            </w:r>
+            <w:r>
+              <w:t>.30</w:t>
+            </w:r>
+            <w:r>
+              <w:t xml:space="preserve"> (accès GLPI via </w:t>
+            </w:r>
+            <w:r>
+              <w:t>l’adresse </w:t>
+            </w:r>
+            <w:hyperlink r:id="rId14" w:history="1">
+              <w:r>
+                <w:rPr>
+                  <w:rStyle w:val="Hyperlink"/>
+                </w:rPr>
+                <w:t>http://glpi.lab.local</w:t>
+              </w:r>
+            </w:hyperlink>
+            <w:r>
+              <w:t>)</w:t>
+            </w:r>
+          </w:p>
+          <w:p>
+            <w:pPr>
+              <w:snapToGrid w:val="0"/>
+              <w:spacing w:line="276" w:lineRule="auto"/>
+            </w:pPr>
+          </w:p>
+          <w:p>
+            <w:pPr>
+              <w:snapToGrid w:val="0"/>
+              <w:spacing w:line="276" w:lineRule="auto"/>
+            </w:pPr>
+            <w:r>
+              <w:t xml:space="preserve">Le domaine </w:t>
+            </w:r>
+            <w:proofErr w:type="spellStart"/>
             <w:r>
               <w:t>LAB.local</w:t>
             </w:r>
             <w:proofErr w:type="spellEnd"/>
             <w:r>
-              <w:t xml:space="preserve"> -&gt; 192.168.6</w:t>
+              <w:t xml:space="preserve"> </w:t>
+            </w:r>
+            <w:r>
+              <w:t>est accessible pour les clients connectés sur le réseau, les postes sont</w:t>
+            </w:r>
+            <w:r>
+              <w:t xml:space="preserve"> dans le </w:t>
+            </w:r>
+            <w:r>
+              <w:t>domaine</w:t>
+            </w:r>
+            <w:r>
+              <w:t>.</w:t>
+            </w:r>
+          </w:p>
+          <w:p>
+            <w:pPr>
+              <w:snapToGrid w:val="0"/>
+              <w:spacing w:line="276" w:lineRule="auto"/>
+            </w:pPr>
+          </w:p>
+          <w:p>
+            <w:pPr>
+              <w:snapToGrid w:val="0"/>
+              <w:spacing w:line="276" w:lineRule="auto"/>
+              <w:rPr>
+                <w:u w:val="single"/>
+              </w:rPr>
+            </w:pPr>
+            <w:r>
+              <w:rPr>
+                <w:u w:val="single"/>
+              </w:rPr>
+              <w:t xml:space="preserve">Adresses IP via DHCP : </w:t>
+            </w:r>
+          </w:p>
+          <w:p>
+            <w:pPr>
+              <w:snapToGrid w:val="0"/>
+              <w:spacing w:line="276" w:lineRule="auto"/>
+              <w:rPr>
+                <w:u w:val="single"/>
+              </w:rPr>
+            </w:pPr>
+          </w:p>
+          <w:p>
+            <w:pPr>
+              <w:snapToGrid w:val="0"/>
+              <w:spacing w:line="276" w:lineRule="auto"/>
+            </w:pPr>
+            <w:r>
+              <w:t xml:space="preserve"> Pour le VLAN </w:t>
+            </w:r>
+            <w:r>
+              <w:t>2</w:t>
+            </w:r>
+            <w:r>
+              <w:t>2</w:t>
             </w:r>
             <w:r>
               <w:t>1</w:t>
             </w:r>
             <w:r>
-              <w:t>.10</w:t>
+              <w:t xml:space="preserve"> – RH : </w:t>
             </w:r>
           </w:p>
           <w:p>
@@ -9316,25 +9542,40 @@
               <w:snapToGrid w:val="0"/>
               <w:spacing w:line="276" w:lineRule="auto"/>
             </w:pPr>
-            <w:proofErr w:type="spellStart"/>
-            <w:proofErr w:type="gramStart"/>
-            <w:r>
-              <w:t>glpi.lab.local</w:t>
-            </w:r>
-            <w:proofErr w:type="spellEnd"/>
-            <w:proofErr w:type="gramEnd"/>
-            <w:r>
-              <w:t xml:space="preserve"> -&gt; 192.168.6</w:t>
+            <w:r>
+              <w:t>Etendue de 192.168.</w:t>
+            </w:r>
+            <w:r>
+              <w:t>2</w:t>
+            </w:r>
+            <w:r>
+              <w:t>2</w:t>
             </w:r>
             <w:r>
               <w:t>1</w:t>
             </w:r>
             <w:r>
-              <w:t>.30</w:t>
-            </w:r>
-          </w:p>
-          <w:p>
-            <w:pPr>
+              <w:t>.100</w:t>
+            </w:r>
+            <w:r>
+              <w:t xml:space="preserve"> à 192.168.221.</w:t>
+            </w:r>
+            <w:r>
+              <w:t>200 pour les machines clientes</w:t>
+            </w:r>
+            <w:r>
+              <w:t xml:space="preserve"> </w:t>
+            </w:r>
+            <w:r>
+              <w:t xml:space="preserve">du service </w:t>
+            </w:r>
+            <w:r>
+              <w:t>RH</w:t>
+            </w:r>
+          </w:p>
+          <w:p>
+            <w:pPr>
+              <w:pStyle w:val="ListParagraph"/>
               <w:snapToGrid w:val="0"/>
               <w:spacing w:line="276" w:lineRule="auto"/>
             </w:pPr>
@@ -9345,98 +9586,19 @@
               <w:spacing w:line="276" w:lineRule="auto"/>
             </w:pPr>
             <w:r>
-              <w:t>Pour les utilisateurs l’accès à GLPI peut se faire sur l’adresse </w:t>
-            </w:r>
-            <w:hyperlink r:id="rId15" w:history="1">
-              <w:r>
-                <w:rPr>
-                  <w:rStyle w:val="Hyperlink"/>
-                </w:rPr>
-                <w:t>http://glpi.lab.local</w:t>
-              </w:r>
-            </w:hyperlink>
-            <w:r>
-              <w:t>.</w:t>
-            </w:r>
-          </w:p>
-          <w:p>
-            <w:pPr>
-              <w:snapToGrid w:val="0"/>
-              <w:spacing w:line="276" w:lineRule="auto"/>
-            </w:pPr>
-            <w:r>
-              <w:t xml:space="preserve">Le domaine </w:t>
-            </w:r>
-            <w:proofErr w:type="spellStart"/>
-            <w:r>
-              <w:t>LAB.local</w:t>
-            </w:r>
-            <w:proofErr w:type="spellEnd"/>
-            <w:r>
-              <w:t xml:space="preserve"> </w:t>
-            </w:r>
-            <w:r>
-              <w:t>est accessible pour les clients connectés sur le réseau, les postes sont</w:t>
-            </w:r>
-            <w:r>
-              <w:t xml:space="preserve"> dans le </w:t>
-            </w:r>
-            <w:r>
-              <w:t>domaine</w:t>
-            </w:r>
-            <w:r>
-              <w:t>.</w:t>
-            </w:r>
-          </w:p>
-          <w:p>
-            <w:pPr>
-              <w:snapToGrid w:val="0"/>
-              <w:spacing w:line="276" w:lineRule="auto"/>
-            </w:pPr>
-          </w:p>
-          <w:p>
-            <w:pPr>
-              <w:snapToGrid w:val="0"/>
-              <w:spacing w:line="276" w:lineRule="auto"/>
-              <w:rPr>
-                <w:u w:val="single"/>
-              </w:rPr>
-            </w:pPr>
-            <w:r>
-              <w:rPr>
-                <w:u w:val="single"/>
-              </w:rPr>
-              <w:t xml:space="preserve">Adresses IP via DHCP : </w:t>
-            </w:r>
-          </w:p>
-          <w:p>
-            <w:pPr>
-              <w:snapToGrid w:val="0"/>
-              <w:spacing w:line="276" w:lineRule="auto"/>
-              <w:rPr>
-                <w:u w:val="single"/>
-              </w:rPr>
-            </w:pPr>
-          </w:p>
-          <w:p>
-            <w:pPr>
-              <w:snapToGrid w:val="0"/>
-              <w:spacing w:line="276" w:lineRule="auto"/>
-            </w:pPr>
-            <w:r>
-              <w:t xml:space="preserve"> Pour le VLAN </w:t>
-            </w:r>
-            <w:r>
-              <w:t>2</w:t>
-            </w:r>
-            <w:r>
-              <w:t>2</w:t>
-            </w:r>
-            <w:r>
-              <w:t>1</w:t>
-            </w:r>
-            <w:r>
-              <w:t xml:space="preserve"> – RH : </w:t>
+              <w:t xml:space="preserve">Pour le VLAN </w:t>
+            </w:r>
+            <w:r>
+              <w:t>222</w:t>
+            </w:r>
+            <w:r>
+              <w:t xml:space="preserve"> – </w:t>
+            </w:r>
+            <w:r>
+              <w:t>Direction</w:t>
+            </w:r>
+            <w:r>
+              <w:t xml:space="preserve"> : </w:t>
             </w:r>
           </w:p>
           <w:p>
@@ -9453,31 +9615,25 @@
               <w:t>Etendue de 192.168.</w:t>
             </w:r>
             <w:r>
-              <w:t>2</w:t>
-            </w:r>
-            <w:r>
-              <w:t>2</w:t>
-            </w:r>
-            <w:r>
-              <w:t>1</w:t>
+              <w:t>222</w:t>
             </w:r>
             <w:r>
               <w:t>.100</w:t>
             </w:r>
             <w:r>
-              <w:t xml:space="preserve"> à 192.168.221.</w:t>
-            </w:r>
-            <w:r>
-              <w:t>200 pour les machines clientes</w:t>
-            </w:r>
-            <w:r>
-              <w:t xml:space="preserve"> </w:t>
+              <w:t xml:space="preserve"> à </w:t>
+            </w:r>
+            <w:r>
+              <w:t>192.168.222.</w:t>
+            </w:r>
+            <w:r>
+              <w:t xml:space="preserve">200 pour les machines clientes </w:t>
             </w:r>
             <w:r>
               <w:t xml:space="preserve">du service </w:t>
             </w:r>
             <w:r>
-              <w:t>RH</w:t>
+              <w:t>Direction</w:t>
             </w:r>
           </w:p>
           <w:p>
@@ -9496,16 +9652,10 @@
               <w:t xml:space="preserve">Pour le VLAN </w:t>
             </w:r>
             <w:r>
-              <w:t>222</w:t>
-            </w:r>
-            <w:r>
-              <w:t xml:space="preserve"> – </w:t>
-            </w:r>
-            <w:r>
-              <w:t>Direction</w:t>
-            </w:r>
-            <w:r>
-              <w:t xml:space="preserve"> : </w:t>
+              <w:t>223</w:t>
+            </w:r>
+            <w:r>
+              <w:t> :</w:t>
             </w:r>
           </w:p>
           <w:p>
@@ -9519,116 +9669,360 @@
               <w:spacing w:line="276" w:lineRule="auto"/>
             </w:pPr>
             <w:r>
-              <w:t>Etendue de 192.168.</w:t>
-            </w:r>
-            <w:r>
-              <w:t>222</w:t>
-            </w:r>
-            <w:r>
-              <w:t>.100</w:t>
-            </w:r>
-            <w:r>
-              <w:t xml:space="preserve"> à </w:t>
-            </w:r>
-            <w:r>
-              <w:t>192.168.222.</w:t>
-            </w:r>
-            <w:r>
-              <w:t xml:space="preserve">200 pour les machines clientes </w:t>
-            </w:r>
-            <w:r>
-              <w:t xml:space="preserve">du service </w:t>
-            </w:r>
-            <w:r>
-              <w:t>Direction</w:t>
-            </w:r>
-          </w:p>
-          <w:p>
-            <w:pPr>
-              <w:pStyle w:val="ListParagraph"/>
+              <w:t>L</w:t>
+            </w:r>
+            <w:r>
+              <w:t>es serveurs ont des adresses IP statiques pour garantir la disponibilité des services</w:t>
+            </w:r>
+            <w:r>
+              <w:t xml:space="preserve"> et </w:t>
+            </w:r>
+            <w:r>
+              <w:t xml:space="preserve">ne pas changer </w:t>
+            </w:r>
+            <w:r>
+              <w:t>les configurations</w:t>
+            </w:r>
+            <w:r>
+              <w:t>.</w:t>
+            </w:r>
+          </w:p>
+          <w:p>
+            <w:pPr>
               <w:snapToGrid w:val="0"/>
               <w:spacing w:line="276" w:lineRule="auto"/>
+              <w:rPr>
+                <w:rFonts w:ascii="Arial" w:hAnsi="Arial"/>
+                <w:bCs/>
+                <w:sz w:val="20"/>
+                <w:szCs w:val="20"/>
+                <w:u w:val="single"/>
+              </w:rPr>
             </w:pPr>
           </w:p>
           <w:p>
             <w:pPr>
               <w:snapToGrid w:val="0"/>
               <w:spacing w:line="276" w:lineRule="auto"/>
-            </w:pPr>
-            <w:r>
-              <w:t xml:space="preserve">Pour le VLAN </w:t>
-            </w:r>
-            <w:r>
-              <w:t>223</w:t>
-            </w:r>
-            <w:r>
-              <w:t> :</w:t>
+              <w:rPr>
+                <w:bCs/>
+                <w:u w:val="single"/>
+              </w:rPr>
+            </w:pPr>
+            <w:r>
+              <w:rPr>
+                <w:bCs/>
+                <w:u w:val="single"/>
+              </w:rPr>
+              <w:t xml:space="preserve">Mise en place du VPN </w:t>
+            </w:r>
+            <w:proofErr w:type="spellStart"/>
+            <w:r>
+              <w:rPr>
+                <w:bCs/>
+                <w:u w:val="single"/>
+              </w:rPr>
+              <w:t>TailScale</w:t>
+            </w:r>
+            <w:proofErr w:type="spellEnd"/>
+            <w:r>
+              <w:rPr>
+                <w:bCs/>
+                <w:u w:val="single"/>
+              </w:rPr>
+              <w:t xml:space="preserve"> sur l’hyperviseur </w:t>
+            </w:r>
+            <w:proofErr w:type="spellStart"/>
+            <w:r>
+              <w:rPr>
+                <w:bCs/>
+                <w:u w:val="single"/>
+              </w:rPr>
+              <w:t>Proxmox</w:t>
+            </w:r>
+            <w:proofErr w:type="spellEnd"/>
+            <w:r>
+              <w:rPr>
+                <w:bCs/>
+                <w:u w:val="single"/>
+              </w:rPr>
+              <w:t xml:space="preserve"> : </w:t>
             </w:r>
           </w:p>
           <w:p>
             <w:pPr>
               <w:snapToGrid w:val="0"/>
               <w:spacing w:line="276" w:lineRule="auto"/>
+              <w:rPr>
+                <w:bCs/>
+                <w:u w:val="single"/>
+              </w:rPr>
+            </w:pPr>
+          </w:p>
+          <w:p>
+            <w:pPr>
+              <w:rPr>
+                <w:bCs/>
+              </w:rPr>
+            </w:pPr>
+            <w:r>
+              <w:rPr>
+                <w:bCs/>
+              </w:rPr>
+              <w:lastRenderedPageBreak/>
+              <w:t xml:space="preserve">Afin de permettre l'administration à distance sécurisée de l'infrastructure </w:t>
+            </w:r>
+            <w:proofErr w:type="spellStart"/>
+            <w:r>
+              <w:rPr>
+                <w:bCs/>
+              </w:rPr>
+              <w:t>NetCorp</w:t>
+            </w:r>
+            <w:proofErr w:type="spellEnd"/>
+            <w:r>
+              <w:rPr>
+                <w:bCs/>
+              </w:rPr>
+              <w:t xml:space="preserve">, un accès VPN a été mis en place via </w:t>
+            </w:r>
+            <w:proofErr w:type="spellStart"/>
+            <w:r>
+              <w:rPr>
+                <w:bCs/>
+              </w:rPr>
+              <w:t>TailScale</w:t>
+            </w:r>
+            <w:proofErr w:type="spellEnd"/>
+            <w:r>
+              <w:rPr>
+                <w:bCs/>
+              </w:rPr>
+              <w:t xml:space="preserve">. Par choix de sécurité, </w:t>
+            </w:r>
+            <w:proofErr w:type="spellStart"/>
+            <w:r>
+              <w:rPr>
+                <w:bCs/>
+              </w:rPr>
+              <w:t>TailScale</w:t>
+            </w:r>
+            <w:proofErr w:type="spellEnd"/>
+            <w:r>
+              <w:rPr>
+                <w:bCs/>
+              </w:rPr>
+              <w:t xml:space="preserve"> n'a pas été installé directement sur l'hyperviseur </w:t>
+            </w:r>
+            <w:proofErr w:type="spellStart"/>
+            <w:r>
+              <w:rPr>
+                <w:bCs/>
+              </w:rPr>
+              <w:t>Proxmox</w:t>
+            </w:r>
+            <w:proofErr w:type="spellEnd"/>
+            <w:r>
+              <w:rPr>
+                <w:bCs/>
+              </w:rPr>
+              <w:t>, mais sur une VM dédiée nommée DEBIAN-VPN, tournant sous Debian.</w:t>
+            </w:r>
+          </w:p>
+          <w:p>
+            <w:pPr>
+              <w:rPr>
+                <w:bCs/>
+              </w:rPr>
+            </w:pPr>
+          </w:p>
+          <w:p>
+            <w:pPr>
+              <w:rPr>
+                <w:bCs/>
+              </w:rPr>
+            </w:pPr>
+            <w:r>
+              <w:rPr>
+                <w:bCs/>
+              </w:rPr>
+              <w:t xml:space="preserve">Cela </w:t>
+            </w:r>
+            <w:r>
+              <w:rPr>
+                <w:bCs/>
+              </w:rPr>
+              <w:t>permet</w:t>
+            </w:r>
+            <w:r>
+              <w:rPr>
+                <w:bCs/>
+              </w:rPr>
+              <w:t xml:space="preserve"> d’assurer </w:t>
+            </w:r>
+            <w:r>
+              <w:rPr>
+                <w:bCs/>
+              </w:rPr>
+              <w:t xml:space="preserve">les points suivants </w:t>
+            </w:r>
+            <w:r>
+              <w:rPr>
+                <w:bCs/>
+              </w:rPr>
+              <w:t>:</w:t>
+            </w:r>
+          </w:p>
+          <w:p>
+            <w:pPr>
+              <w:rPr>
+                <w:bCs/>
+              </w:rPr>
+            </w:pPr>
+          </w:p>
+          <w:p>
+            <w:pPr>
+              <w:pStyle w:val="ListParagraph"/>
+              <w:numPr>
+                <w:ilvl w:val="0"/>
+                <w:numId w:val="11"/>
+              </w:numPr>
+              <w:rPr>
+                <w:bCs/>
+              </w:rPr>
+            </w:pPr>
+            <w:r>
+              <w:rPr>
+                <w:bCs/>
+              </w:rPr>
+              <w:t xml:space="preserve">Isolation : en cas de compromission du VPN, l'attaquant accède uniquement à la VM DEBIAN-VPN et non à l'hyperviseur </w:t>
+            </w:r>
+            <w:proofErr w:type="spellStart"/>
+            <w:r>
+              <w:rPr>
+                <w:bCs/>
+              </w:rPr>
+              <w:t>Proxmox</w:t>
+            </w:r>
+            <w:proofErr w:type="spellEnd"/>
+            <w:r>
+              <w:rPr>
+                <w:bCs/>
+              </w:rPr>
+              <w:t>.</w:t>
+            </w:r>
+          </w:p>
+          <w:p>
+            <w:pPr>
+              <w:rPr>
+                <w:bCs/>
+              </w:rPr>
+            </w:pPr>
+          </w:p>
+          <w:p>
+            <w:pPr>
+              <w:pStyle w:val="ListParagraph"/>
+              <w:numPr>
+                <w:ilvl w:val="0"/>
+                <w:numId w:val="11"/>
+              </w:numPr>
+              <w:rPr>
+                <w:bCs/>
+              </w:rPr>
+            </w:pPr>
+            <w:r>
+              <w:rPr>
+                <w:bCs/>
+              </w:rPr>
+              <w:t xml:space="preserve">Principe du moindre privilège : la VM n'a pas accès aux ressources de gestion de </w:t>
+            </w:r>
+            <w:proofErr w:type="spellStart"/>
+            <w:r>
+              <w:rPr>
+                <w:bCs/>
+              </w:rPr>
+              <w:t>Proxmox</w:t>
+            </w:r>
+            <w:proofErr w:type="spellEnd"/>
+            <w:r>
+              <w:rPr>
+                <w:bCs/>
+              </w:rPr>
+              <w:t xml:space="preserve"> (API, interface web).</w:t>
+            </w:r>
+          </w:p>
+          <w:p>
+            <w:pPr>
+              <w:pStyle w:val="ListParagraph"/>
+              <w:rPr>
+                <w:bCs/>
+              </w:rPr>
+            </w:pPr>
+          </w:p>
+          <w:p>
+            <w:pPr>
+              <w:rPr>
+                <w:bCs/>
+              </w:rPr>
+            </w:pPr>
+          </w:p>
+          <w:p>
+            <w:pPr>
+              <w:pStyle w:val="ListParagraph"/>
+              <w:numPr>
+                <w:ilvl w:val="0"/>
+                <w:numId w:val="11"/>
+              </w:numPr>
+              <w:rPr>
+                <w:bCs/>
+              </w:rPr>
+            </w:pPr>
+            <w:r>
+              <w:rPr>
+                <w:bCs/>
+              </w:rPr>
+              <w:t>Facilité de maintenance : la VM peut être stoppée, reconfigurée ou recréée sans impacter l'hyperviseur.</w:t>
+            </w:r>
+          </w:p>
+          <w:p>
+            <w:pPr>
+              <w:rPr>
+                <w:bCs/>
+              </w:rPr>
             </w:pPr>
           </w:p>
           <w:p>
             <w:pPr>
               <w:snapToGrid w:val="0"/>
               <w:spacing w:line="276" w:lineRule="auto"/>
-            </w:pPr>
-            <w:r>
-              <w:t>L</w:t>
-            </w:r>
-            <w:r>
-              <w:t>es serveurs ont des adresses IP statiques pour garantir la disponibilité des services</w:t>
-            </w:r>
-            <w:r>
-              <w:t xml:space="preserve"> et </w:t>
-            </w:r>
-            <w:r>
-              <w:t xml:space="preserve">ne pas changer </w:t>
-            </w:r>
-            <w:r>
-              <w:t>les configurations</w:t>
-            </w:r>
-            <w:r>
-              <w:t>.</w:t>
-            </w:r>
-          </w:p>
-          <w:p>
-            <w:pPr>
-              <w:snapToGrid w:val="0"/>
-              <w:spacing w:line="276" w:lineRule="auto"/>
-              <w:rPr>
-                <w:rFonts w:ascii="Arial" w:hAnsi="Arial"/>
-                <w:bCs/>
-                <w:sz w:val="20"/>
-                <w:szCs w:val="20"/>
-                <w:u w:val="single"/>
-              </w:rPr>
-            </w:pPr>
-          </w:p>
-          <w:p>
-            <w:pPr>
-              <w:snapToGrid w:val="0"/>
-              <w:spacing w:line="276" w:lineRule="auto"/>
-              <w:rPr>
-                <w:bCs/>
-                <w:u w:val="single"/>
-              </w:rPr>
-            </w:pPr>
-            <w:r>
-              <w:rPr>
-                <w:bCs/>
-                <w:u w:val="single"/>
-              </w:rPr>
-              <w:t xml:space="preserve">Mise en place du VPN </w:t>
+              <w:rPr>
+                <w:bCs/>
+              </w:rPr>
+            </w:pPr>
+            <w:r>
+              <w:rPr>
+                <w:bCs/>
+              </w:rPr>
+              <w:t xml:space="preserve">La VM DEBIAN-VPN est configurée en tant que </w:t>
             </w:r>
             <w:proofErr w:type="spellStart"/>
             <w:r>
               <w:rPr>
                 <w:bCs/>
-                <w:u w:val="single"/>
+              </w:rPr>
+              <w:t>subnet</w:t>
+            </w:r>
+            <w:proofErr w:type="spellEnd"/>
+            <w:r>
+              <w:rPr>
+                <w:bCs/>
+              </w:rPr>
+              <w:t xml:space="preserve"> router </w:t>
+            </w:r>
+            <w:proofErr w:type="spellStart"/>
+            <w:r>
+              <w:rPr>
+                <w:bCs/>
               </w:rPr>
               <w:t>TailScale</w:t>
             </w:r>
@@ -9636,15 +10030,27 @@
             <w:r>
               <w:rPr>
                 <w:bCs/>
-                <w:u w:val="single"/>
-              </w:rPr>
-              <w:t xml:space="preserve"> sur l’hyperviseur </w:t>
+              </w:rPr>
+              <w:t xml:space="preserve">, ce qui lui permet d'exposer l'ensemble du sous-réseau 192.168.223.0/24 aux administrateurs connectés au réseau </w:t>
             </w:r>
             <w:proofErr w:type="spellStart"/>
             <w:r>
               <w:rPr>
                 <w:bCs/>
-                <w:u w:val="single"/>
+              </w:rPr>
+              <w:t>TailScale</w:t>
+            </w:r>
+            <w:proofErr w:type="spellEnd"/>
+            <w:r>
+              <w:rPr>
+                <w:bCs/>
+              </w:rPr>
+              <w:t xml:space="preserve">, sans exposer </w:t>
+            </w:r>
+            <w:proofErr w:type="spellStart"/>
+            <w:r>
+              <w:rPr>
+                <w:bCs/>
               </w:rPr>
               <w:t>Proxmox</w:t>
             </w:r>
@@ -9652,130 +10058,9 @@
             <w:r>
               <w:rPr>
                 <w:bCs/>
-                <w:u w:val="single"/>
-              </w:rPr>
-              <w:t xml:space="preserve"> : </w:t>
-            </w:r>
-          </w:p>
-          <w:p>
-            <w:pPr>
-              <w:snapToGrid w:val="0"/>
-              <w:spacing w:line="276" w:lineRule="auto"/>
-              <w:rPr>
-                <w:bCs/>
-                <w:u w:val="single"/>
-              </w:rPr>
-            </w:pPr>
-          </w:p>
-          <w:p>
-            <w:pPr>
-              <w:snapToGrid w:val="0"/>
-              <w:spacing w:line="276" w:lineRule="auto"/>
-              <w:rPr>
-                <w:bCs/>
-              </w:rPr>
-            </w:pPr>
-            <w:r>
-              <w:rPr>
-                <w:bCs/>
-              </w:rPr>
-              <w:lastRenderedPageBreak/>
-              <w:t xml:space="preserve">Le VPN est mis en place sur la VM DEBIAN-VPN. Nous avons créé une VM uniquement pour le VPN et non directement sur le serveur </w:t>
-            </w:r>
-            <w:proofErr w:type="spellStart"/>
-            <w:r>
-              <w:rPr>
-                <w:bCs/>
-              </w:rPr>
-              <w:t>Proxmox</w:t>
-            </w:r>
-            <w:proofErr w:type="spellEnd"/>
-            <w:r>
-              <w:rPr>
-                <w:bCs/>
-              </w:rPr>
-              <w:t xml:space="preserve"> afin de ne pas donner un accès direct au serveur </w:t>
-            </w:r>
-            <w:proofErr w:type="spellStart"/>
-            <w:r>
-              <w:rPr>
-                <w:bCs/>
-              </w:rPr>
-              <w:t>Proxmox</w:t>
-            </w:r>
-            <w:proofErr w:type="spellEnd"/>
-            <w:r>
-              <w:rPr>
-                <w:bCs/>
-              </w:rPr>
-              <w:t xml:space="preserve"> en cas d’attaque.</w:t>
-            </w:r>
-          </w:p>
-          <w:p>
-            <w:pPr>
-              <w:snapToGrid w:val="0"/>
-              <w:spacing w:line="276" w:lineRule="auto"/>
-              <w:rPr>
-                <w:bCs/>
-              </w:rPr>
-            </w:pPr>
-          </w:p>
-          <w:p>
-            <w:pPr>
-              <w:snapToGrid w:val="0"/>
-              <w:spacing w:line="276" w:lineRule="auto"/>
-              <w:rPr>
-                <w:rFonts w:ascii="Arial" w:hAnsi="Arial"/>
-                <w:bCs/>
-                <w:sz w:val="20"/>
-                <w:szCs w:val="20"/>
-                <w:lang w:val="en-US"/>
-              </w:rPr>
-            </w:pPr>
-            <w:r>
-              <w:rPr>
-                <w:rFonts w:ascii="Arial" w:hAnsi="Arial"/>
-                <w:bCs/>
-                <w:sz w:val="20"/>
-                <w:szCs w:val="20"/>
-                <w:lang w:val="en-US"/>
-              </w:rPr>
-              <w:t>curl -</w:t>
-            </w:r>
-            <w:proofErr w:type="spellStart"/>
-            <w:r>
-              <w:rPr>
-                <w:rFonts w:ascii="Arial" w:hAnsi="Arial"/>
-                <w:bCs/>
-                <w:sz w:val="20"/>
-                <w:szCs w:val="20"/>
-                <w:lang w:val="en-US"/>
-              </w:rPr>
-              <w:t>fsSL</w:t>
-            </w:r>
-            <w:proofErr w:type="spellEnd"/>
-            <w:r>
-              <w:rPr>
-                <w:rFonts w:ascii="Arial" w:hAnsi="Arial"/>
-                <w:bCs/>
-                <w:sz w:val="20"/>
-                <w:szCs w:val="20"/>
-                <w:lang w:val="en-US"/>
-              </w:rPr>
-              <w:t xml:space="preserve"> https://tailscale.com/install.sh | </w:t>
-            </w:r>
-            <w:proofErr w:type="spellStart"/>
-            <w:r>
-              <w:rPr>
-                <w:rFonts w:ascii="Arial" w:hAnsi="Arial"/>
-                <w:bCs/>
-                <w:sz w:val="20"/>
-                <w:szCs w:val="20"/>
-                <w:lang w:val="en-US"/>
-              </w:rPr>
-              <w:t>sh</w:t>
-            </w:r>
-            <w:proofErr w:type="spellEnd"/>
+              </w:rPr>
+              <w:t xml:space="preserve"> directement sur internet.</w:t>
+            </w:r>
           </w:p>
         </w:tc>
       </w:tr>
@@ -9804,7 +10089,6 @@
                 <w:b/>
                 <w:sz w:val="20"/>
                 <w:szCs w:val="20"/>
-                <w:lang w:val="en-US"/>
               </w:rPr>
             </w:pPr>
           </w:p>
@@ -9820,7 +10104,6 @@
           <w:bCs/>
           <w:sz w:val="22"/>
           <w:szCs w:val="22"/>
-          <w:lang w:val="en-US"/>
         </w:rPr>
       </w:pPr>
       <w:r>
@@ -9830,7 +10113,6 @@
           <w:bCs/>
           <w:sz w:val="22"/>
           <w:szCs w:val="22"/>
-          <w:lang w:val="en-US"/>
         </w:rPr>
         <w:br w:type="page"/>
       </w:r>
@@ -17118,7 +17400,7 @@
           <w:szCs w:val="22"/>
         </w:rPr>
         <w:sectPr>
-          <w:footerReference w:type="default" r:id="rId16"/>
+          <w:footerReference w:type="default" r:id="rId15"/>
           <w:pgSz w:w="11900" w:h="16840"/>
           <w:pgMar w:top="851" w:right="1134" w:bottom="851" w:left="1134" w:header="709" w:footer="709" w:gutter="0"/>
           <w:cols w:space="708"/>
@@ -53455,7 +53737,7 @@
   <w:style w:type="paragraph" w:default="1" w:styleId="Normal">
     <w:name w:val="Normal"/>
     <w:qFormat/>
-    <w:rsid w:val="003B19E5"/>
+    <w:rsid w:val="00E27AA0"/>
     <w:pPr>
       <w:suppressAutoHyphens/>
     </w:pPr>

</xml_diff>